<commit_message>
Add paste-ready OSF preregistration; note out-of-box AI in prereg
- OSF-Preregistration-Ready.(md|docx): our prereg mapped field-by-field to the
  OSF "Preregistration" schema (Study Info / Design / Sampling / Variables /
  Analysis / Other), with the interaction-pattern analysis (H3) and out-of-box
  Opus 4.7 intervention. Paste-ready; register before first enrollment.
- Preregistration-Outline: AI arm now specified as Opus 4.7 out of the box.
- .gitignore: exclude db-backup-*/ (participant-level DB backups, local only).

Co-Authored-By: Claude Opus 4.7 <noreply@anthropic.com>
</commit_message>
<xml_diff>
--- a/docs/Preregistration-Outline.docx
+++ b/docs/Preregistration-Outline.docx
@@ -479,7 +479,20 @@
         <w:t xml:space="preserve"> </w:t>
       </w:r>
       <w:r>
-        <w:t xml:space="preserve">embedded LLM chat assistant (Anthropic Claude [model/version]) available during the five-task case.</w:t>
+        <w:t xml:space="preserve">embedded LLM chat assistant (Anthropic Claude Opus 4.7, used</w:t>
+      </w:r>
+      <w:r>
+        <w:t xml:space="preserve"> </w:t>
+      </w:r>
+      <w:r>
+        <w:rPr>
+          <w:b/>
+          <w:bCs/>
+        </w:rPr>
+        <w:t xml:space="preserve">out of the box — no system prompt or configuration</w:t>
+      </w:r>
+      <w:r>
+        <w:t xml:space="preserve">) available during the five-task case.</w:t>
       </w:r>
       <w:r>
         <w:t xml:space="preserve"> </w:t>

</xml_diff>